<commit_message>
Update Render URL to cloud-notes-app (cloud-notes taken)
- Replace cloud-notes.onrender.com with cloud-notes-app.onrender.com
  in README.md, docs/LINKEDIN_POST.md, and report build scripts
- Rebuild Module3_Cloud_Web_App_Report.docx and regenerate PDF
</commit_message>
<xml_diff>
--- a/Module3_Cloud_Web_App_Report.docx
+++ b/Module3_Cloud_Web_App_Report.docx
@@ -11756,7 +11756,7 @@
           <w:color w:val="262626"/>
           <w:sz w:val="21"/>
         </w:rPr>
-        <w:t>https://cloud-notes.onrender.com</w:t>
+        <w:t>https://cloud-notes-app.onrender.com</w:t>
       </w:r>
       <w:r>
         <w:rPr>
@@ -23330,7 +23330,7 @@
                 <w:color w:val="262626"/>
                 <w:sz w:val="19"/>
               </w:rPr>
-              <w:t>https://cloud-notes.onrender.com</w:t>
+              <w:t>https://cloud-notes-app.onrender.com</w:t>
             </w:r>
           </w:p>
         </w:tc>
@@ -23390,7 +23390,7 @@
                 <w:color w:val="262626"/>
                 <w:sz w:val="19"/>
               </w:rPr>
-              <w:t>https://cloud-notes.onrender.com/health</w:t>
+              <w:t>https://cloud-notes-app.onrender.com/health</w:t>
             </w:r>
           </w:p>
         </w:tc>
@@ -23448,7 +23448,7 @@
                 <w:color w:val="262626"/>
                 <w:sz w:val="19"/>
               </w:rPr>
-              <w:t>https://cloud-notes.onrender.com/api/notes</w:t>
+              <w:t>https://cloud-notes-app.onrender.com/api/notes</w:t>
             </w:r>
           </w:p>
         </w:tc>

</xml_diff>